<commit_message>
Update scaleway_analisi_cloud_b2b.docx — aggiornamenti 20-30 marzo 2026
</commit_message>
<xml_diff>
--- a/files/scaleway_analisi_cloud_b2b.docx
+++ b/files/scaleway_analisi_cloud_b2b.docx
@@ -6446,6 +6446,533 @@
       <w:pPr/>
       <w:r>
         <w:t>Se Scaleway ottiene la qualifica ACN e costruisce una rete di partner locali entro fine 2026/inizio 2027, il confronto con Fastweb diventa molto piu diretto — soprattutto per le PA che cercano alternative certificate agli hyperscaler americani. Il posizionamento 'cloud sovrano europeo' risuona fortemente nell'attuale clima politico (EU Digital Sovereignty, Cloud Act europeo, AI Act). Il rischio principale e' la velocita' di esecuzione: la qualifica ACN e il partner network richiedono tempo e investimento, e nel frattempo Fastweb consolida la propria posizione.</w:t>
+      </w:r>
+    </w:p>
+    <w:p>
+      <w:r>
+        <w:br w:type="page"/>
+      </w:r>
+    </w:p>
+    <w:p>
+      <w:pPr>
+        <w:pStyle w:val="Heading1"/>
+      </w:pPr>
+      <w:r>
+        <w:t>Aggiornamenti post-lancio (20–30 marzo 2026)</w:t>
+      </w:r>
+    </w:p>
+    <w:p>
+      <w:r>
+        <w:rPr>
+          <w:i/>
+        </w:rPr>
+        <w:t>Dalla data di pubblicazione del presente documento (19 marzo 2026) sono emersi elementi nuovi che integrano e rafforzano l'analisi originale. I punti seguenti aggiornano le sezioni precedenti con informazioni verificate.</w:t>
+      </w:r>
+    </w:p>
+    <w:p>
+      <w:pPr>
+        <w:pStyle w:val="Heading2"/>
+      </w:pPr>
+      <w:r>
+        <w:t>1. Nuova partnership italiana: S2E – Solutions2Enterprises (25 marzo 2026)</w:t>
+      </w:r>
+    </w:p>
+    <w:p>
+      <w:r>
+        <w:t xml:space="preserve">A soli sei giorni dal lancio della region Milano, Scaleway ha firmato una partnership strategica con </w:t>
+      </w:r>
+      <w:r>
+        <w:rPr>
+          <w:b/>
+        </w:rPr>
+        <w:t>S2E (Solutions2Enterprises)</w:t>
+      </w:r>
+      <w:r>
+        <w:t>, società italiana di technology consulting con base a Milano. L'accordo è orientato allo sviluppo e alla diffusione di soluzioni AI-native e infrastrutture cloud sovrane sul mercato italiano.</w:t>
+      </w:r>
+    </w:p>
+    <w:p>
+      <w:r>
+        <w:t>La partnership è significativa perché colma una delle debolezze identificate nell'analisi SWOT originale: la scarsità di partner italiani certificati nel marketplace Scaleway. S2E affianca così Open Gate come secondo system integrator italiano di riferimento, con un posizionamento esplicito su AI e governance dei dati.</w:t>
+      </w:r>
+    </w:p>
+    <w:p>
+      <w:r>
+        <w:rPr>
+          <w:i/>
+        </w:rPr>
+        <w:t>"La partnership con Scaleway rappresenta un passaggio strategico nel percorso di crescita di S2E e nella nostra visione di un'innovazione tecnologica sempre più sicura, sostenibile e aderente alle esigenze di governance dei clienti."</w:t>
+      </w:r>
+    </w:p>
+    <w:p>
+      <w:r>
+        <w:t>— Mario Cubello, Business Line Manager di S2E</w:t>
+      </w:r>
+    </w:p>
+    <w:p>
+      <w:pPr>
+        <w:pStyle w:val="Heading2"/>
+      </w:pPr>
+      <w:r>
+        <w:t>2. Localizzazione delle tre Availability Zone di Milano (confermata)</w:t>
+      </w:r>
+    </w:p>
+    <w:p>
+      <w:r>
+        <w:t>ZeroUnoWeb ha ottenuto dall'AD Damien Lucas la conferma ufficiale della collocazione fisica delle tre AZ della region Milano-Italia:</w:t>
+      </w:r>
+    </w:p>
+    <w:tbl>
+      <w:tblPr>
+        <w:tblStyle w:val="TableGrid"/>
+        <w:tblW w:type="auto" w:w="0"/>
+        <w:tblLook w:firstColumn="1" w:firstRow="1" w:lastColumn="0" w:lastRow="0" w:noHBand="0" w:noVBand="1" w:val="04A0"/>
+      </w:tblPr>
+      <w:tblGrid>
+        <w:gridCol w:w="3022"/>
+        <w:gridCol w:w="3022"/>
+        <w:gridCol w:w="3022"/>
+      </w:tblGrid>
+      <w:tr>
+        <w:tc>
+          <w:tcPr>
+            <w:tcW w:type="dxa" w:w="1134"/>
+          </w:tcPr>
+          <w:p>
+            <w:r>
+              <w:rPr>
+                <w:b/>
+              </w:rPr>
+              <w:t>AZ</w:t>
+            </w:r>
+          </w:p>
+        </w:tc>
+        <w:tc>
+          <w:tcPr>
+            <w:tcW w:type="dxa" w:w="2835"/>
+          </w:tcPr>
+          <w:p>
+            <w:r>
+              <w:rPr>
+                <w:b/>
+              </w:rPr>
+              <w:t>Location</w:t>
+            </w:r>
+          </w:p>
+        </w:tc>
+        <w:tc>
+          <w:tcPr>
+            <w:tcW w:type="dxa" w:w="3969"/>
+          </w:tcPr>
+          <w:p>
+            <w:r>
+              <w:rPr>
+                <w:b/>
+              </w:rPr>
+              <w:t>Stato</w:t>
+            </w:r>
+          </w:p>
+        </w:tc>
+      </w:tr>
+      <w:tr>
+        <w:tc>
+          <w:tcPr>
+            <w:tcW w:type="dxa" w:w="1134"/>
+          </w:tcPr>
+          <w:p>
+            <w:r>
+              <w:t>MIL-1</w:t>
+            </w:r>
+          </w:p>
+        </w:tc>
+        <w:tc>
+          <w:tcPr>
+            <w:tcW w:type="dxa" w:w="2835"/>
+          </w:tcPr>
+          <w:p>
+            <w:r>
+              <w:t>Settimo Milanese</w:t>
+            </w:r>
+          </w:p>
+        </w:tc>
+        <w:tc>
+          <w:tcPr>
+            <w:tcW w:type="dxa" w:w="3969"/>
+          </w:tcPr>
+          <w:p>
+            <w:r>
+              <w:rPr>
+                <w:color w:val="377636"/>
+              </w:rPr>
+              <w:t>OPERATIVA (marzo 2026)</w:t>
+            </w:r>
+          </w:p>
+        </w:tc>
+      </w:tr>
+      <w:tr>
+        <w:tc>
+          <w:tcPr>
+            <w:tcW w:type="dxa" w:w="1134"/>
+          </w:tcPr>
+          <w:p>
+            <w:r>
+              <w:t>MIL-2</w:t>
+            </w:r>
+          </w:p>
+        </w:tc>
+        <w:tc>
+          <w:tcPr>
+            <w:tcW w:type="dxa" w:w="2835"/>
+          </w:tcPr>
+          <w:p>
+            <w:r>
+              <w:t>Basiglio (MI)</w:t>
+            </w:r>
+          </w:p>
+        </w:tc>
+        <w:tc>
+          <w:tcPr>
+            <w:tcW w:type="dxa" w:w="3969"/>
+          </w:tcPr>
+          <w:p>
+            <w:r>
+              <w:rPr>
+                <w:color w:val="C07000"/>
+              </w:rPr>
+              <w:t>In completamento — prossimi mesi</w:t>
+            </w:r>
+          </w:p>
+        </w:tc>
+      </w:tr>
+      <w:tr>
+        <w:tc>
+          <w:tcPr>
+            <w:tcW w:type="dxa" w:w="1134"/>
+          </w:tcPr>
+          <w:p>
+            <w:r>
+              <w:t>MIL-3</w:t>
+            </w:r>
+          </w:p>
+        </w:tc>
+        <w:tc>
+          <w:tcPr>
+            <w:tcW w:type="dxa" w:w="2835"/>
+          </w:tcPr>
+          <w:p>
+            <w:r>
+              <w:t>Milano (centro)</w:t>
+            </w:r>
+          </w:p>
+        </w:tc>
+        <w:tc>
+          <w:tcPr>
+            <w:tcW w:type="dxa" w:w="3969"/>
+          </w:tcPr>
+          <w:p>
+            <w:r>
+              <w:rPr>
+                <w:color w:val="C07000"/>
+              </w:rPr>
+              <w:t>In completamento — prossimi mesi</w:t>
+            </w:r>
+          </w:p>
+        </w:tc>
+      </w:tr>
+    </w:tbl>
+    <w:p/>
+    <w:p>
+      <w:r>
+        <w:t>La distribuzione su tre siti distinti (Settimo Milanese, Basiglio, Milano) garantisce la resilienza richiesta per workload mission-critical e conferma che l'architettura della region milanese è coerente con gli standard delle altre region Scaleway (Parigi, Amsterdam, Varsavia).</w:t>
+      </w:r>
+    </w:p>
+    <w:p>
+      <w:pPr>
+        <w:pStyle w:val="Heading2"/>
+      </w:pPr>
+      <w:r>
+        <w:t>3. Posizionamento ufficiale: "immune al Cloud Act" — non semplicemente "sovrano"</w:t>
+      </w:r>
+    </w:p>
+    <w:p>
+      <w:r>
+        <w:t>In un'intervista a ZeroUnoWeb a margine del lancio italiano, l'AD Damien Lucas ha precisato il posizionamento strategico di Scaleway con una distinzione terminologica rilevante per il mercato enterprise e PA.</w:t>
+      </w:r>
+    </w:p>
+    <w:p>
+      <w:r>
+        <w:rPr>
+          <w:b/>
+        </w:rPr>
+        <w:t xml:space="preserve">Il punto chiave: </w:t>
+      </w:r>
+      <w:r>
+        <w:t>Scaleway rifiuta l'etichetta di "cloud sovrano" (che anche AWS e Microsoft usano per i loro prodotti europei) e preferisce "cloud pubblico immune da legislazioni extraterritoriali". La differenza non è semantica: significa che nessun dato elaborato su Scaleway può essere richiesto da autorità straniere senza mandato di un giudice europeo.</w:t>
+      </w:r>
+    </w:p>
+    <w:p>
+      <w:r>
+        <w:t>Lucas ha citato esplicitamente il rischio del "kill switch" americano — la possibilità che le autorità USA impongano ai cloud provider americani di sospendere i servizi per determinati clienti o aree geografiche per ragioni geopolitiche. Scaleway afferma di essere immune da questo rischio, in quanto entità legale e operativa interamente europea, senza azionisti, filiali o dipendenti al di fuori dell'UE.</w:t>
+      </w:r>
+    </w:p>
+    <w:p>
+      <w:r>
+        <w:rPr>
+          <w:i/>
+        </w:rPr>
+        <w:t>"Non mi piace definirlo un cloud pubblico europeo sovrano, perché, ad esempio, AWS ha creato un cloud sovrano europeo in Germania, e io non credo che lo sia."</w:t>
+      </w:r>
+    </w:p>
+    <w:p>
+      <w:r>
+        <w:t>— Damien Lucas, AD Scaleway</w:t>
+      </w:r>
+    </w:p>
+    <w:p>
+      <w:r>
+        <w:t>Questo posizionamento ha implicazioni dirette sulla narrativa commerciale in Italia: negli interlocutori PA e settori regolamentati (banche, sanità, difesa), il differenziatore non è "europeo" in senso geografico, ma "non raggiungibile giuridicamente da Washington" — un messaggio più concreto e misurabile.</w:t>
+      </w:r>
+    </w:p>
+    <w:p>
+      <w:pPr>
+        <w:pStyle w:val="Heading2"/>
+      </w:pPr>
+      <w:r>
+        <w:t>4. Roadmap europea aggiornata: Stoccolma e Francoforte nel 2026</w:t>
+      </w:r>
+    </w:p>
+    <w:p>
+      <w:r>
+        <w:t>È confermato che nel corso del 2026 Scaleway aprirà due ulteriori cloud region europee:</w:t>
+      </w:r>
+    </w:p>
+    <w:p>
+      <w:pPr>
+        <w:pStyle w:val="ListBullet"/>
+      </w:pPr>
+      <w:r>
+        <w:t>Stoccolma (Svezia) — mercato nordico</w:t>
+      </w:r>
+    </w:p>
+    <w:p>
+      <w:pPr>
+        <w:pStyle w:val="ListBullet"/>
+      </w:pPr>
+      <w:r>
+        <w:t>Francoforte (Germania) — mercato DACH, il più grande d'Europa</w:t>
+      </w:r>
+    </w:p>
+    <w:p>
+      <w:r>
+        <w:t>Il finanziamento è supportato dal piano di investimenti da 3 miliardi di euro annunciato da Iliad Group. Con Milano, Stoccolma e Francoforte, Scaleway avrà 6 cloud region europee entro fine 2026 (Parigi, Amsterdam, Varsavia + le tre nuove), posizionandosi come il provider europeo con la copertura geografica più ampia rispetto a Hetzner, IONOS, OVHcloud e altri competitor continentali.</w:t>
+      </w:r>
+    </w:p>
+    <w:p>
+      <w:pPr>
+        <w:pStyle w:val="Heading2"/>
+      </w:pPr>
+      <w:r>
+        <w:t>Sintesi degli impatti sull'analisi originale</w:t>
+      </w:r>
+    </w:p>
+    <w:tbl>
+      <w:tblPr>
+        <w:tblStyle w:val="TableGrid"/>
+        <w:tblW w:type="auto" w:w="0"/>
+        <w:tblLook w:firstColumn="1" w:firstRow="1" w:lastColumn="0" w:lastRow="0" w:noHBand="0" w:noVBand="1" w:val="04A0"/>
+      </w:tblPr>
+      <w:tblGrid>
+        <w:gridCol w:w="3022"/>
+        <w:gridCol w:w="3022"/>
+        <w:gridCol w:w="3022"/>
+      </w:tblGrid>
+      <w:tr>
+        <w:tc>
+          <w:tcPr>
+            <w:tcW w:type="dxa" w:w="1984"/>
+          </w:tcPr>
+          <w:p>
+            <w:r>
+              <w:rPr>
+                <w:b/>
+              </w:rPr>
+              <w:t>Area</w:t>
+            </w:r>
+          </w:p>
+        </w:tc>
+        <w:tc>
+          <w:tcPr>
+            <w:tcW w:type="dxa" w:w="3118"/>
+          </w:tcPr>
+          <w:p>
+            <w:r>
+              <w:rPr>
+                <w:b/>
+              </w:rPr>
+              <w:t>Valutazione originale</w:t>
+            </w:r>
+          </w:p>
+        </w:tc>
+        <w:tc>
+          <w:tcPr>
+            <w:tcW w:type="dxa" w:w="2835"/>
+          </w:tcPr>
+          <w:p>
+            <w:r>
+              <w:rPr>
+                <w:b/>
+              </w:rPr>
+              <w:t>Revisione post-lancio</w:t>
+            </w:r>
+          </w:p>
+        </w:tc>
+      </w:tr>
+      <w:tr>
+        <w:tc>
+          <w:tcPr>
+            <w:tcW w:type="dxa" w:w="1984"/>
+          </w:tcPr>
+          <w:p>
+            <w:r>
+              <w:t>Partner italiani</w:t>
+            </w:r>
+          </w:p>
+        </w:tc>
+        <w:tc>
+          <w:tcPr>
+            <w:tcW w:type="dxa" w:w="3118"/>
+          </w:tcPr>
+          <w:p>
+            <w:r>
+              <w:t>Debolezza — solo Open Gate</w:t>
+            </w:r>
+          </w:p>
+        </w:tc>
+        <w:tc>
+          <w:tcPr>
+            <w:tcW w:type="dxa" w:w="2835"/>
+          </w:tcPr>
+          <w:p>
+            <w:r>
+              <w:t>Parzialmente mitigata — S2E aggiunta come 2° partner italiano</w:t>
+            </w:r>
+          </w:p>
+        </w:tc>
+      </w:tr>
+      <w:tr>
+        <w:tc>
+          <w:tcPr>
+            <w:tcW w:type="dxa" w:w="1984"/>
+          </w:tcPr>
+          <w:p>
+            <w:r>
+              <w:t>AZ Milano</w:t>
+            </w:r>
+          </w:p>
+        </w:tc>
+        <w:tc>
+          <w:tcPr>
+            <w:tcW w:type="dxa" w:w="3118"/>
+          </w:tcPr>
+          <w:p>
+            <w:r>
+              <w:t>Struttura annunciata, dettagli da confermare</w:t>
+            </w:r>
+          </w:p>
+        </w:tc>
+        <w:tc>
+          <w:tcPr>
+            <w:tcW w:type="dxa" w:w="2835"/>
+          </w:tcPr>
+          <w:p>
+            <w:r>
+              <w:t>Confermata: Settimo Milanese (live), Basiglio, Milano</w:t>
+            </w:r>
+          </w:p>
+        </w:tc>
+      </w:tr>
+      <w:tr>
+        <w:tc>
+          <w:tcPr>
+            <w:tcW w:type="dxa" w:w="1984"/>
+          </w:tcPr>
+          <w:p>
+            <w:r>
+              <w:t>Posizionamento Cloud Act</w:t>
+            </w:r>
+          </w:p>
+        </w:tc>
+        <w:tc>
+          <w:tcPr>
+            <w:tcW w:type="dxa" w:w="3118"/>
+          </w:tcPr>
+          <w:p>
+            <w:r>
+              <w:t>Citato come vantaggio differenziante</w:t>
+            </w:r>
+          </w:p>
+        </w:tc>
+        <w:tc>
+          <w:tcPr>
+            <w:tcW w:type="dxa" w:w="2835"/>
+          </w:tcPr>
+          <w:p>
+            <w:r>
+              <w:t>Rafforzato — Lucas con dichiarazione esplicita su kill switch</w:t>
+            </w:r>
+          </w:p>
+        </w:tc>
+      </w:tr>
+      <w:tr>
+        <w:tc>
+          <w:tcPr>
+            <w:tcW w:type="dxa" w:w="1984"/>
+          </w:tcPr>
+          <w:p>
+            <w:r>
+              <w:t>Roadmap europea</w:t>
+            </w:r>
+          </w:p>
+        </w:tc>
+        <w:tc>
+          <w:tcPr>
+            <w:tcW w:type="dxa" w:w="3118"/>
+          </w:tcPr>
+          <w:p>
+            <w:r>
+              <w:t>Stoccolma e Francoforte menzionate genericamente</w:t>
+            </w:r>
+          </w:p>
+        </w:tc>
+        <w:tc>
+          <w:tcPr>
+            <w:tcW w:type="dxa" w:w="2835"/>
+          </w:tcPr>
+          <w:p>
+            <w:r>
+              <w:t>Confermate entrambe nel 2026, finanziamento Iliad Group</w:t>
+            </w:r>
+          </w:p>
+        </w:tc>
+      </w:tr>
+    </w:tbl>
+    <w:p/>
+    <w:p>
+      <w:r>
+        <w:rPr>
+          <w:i/>
+          <w:color w:val="909090"/>
+          <w:sz w:val="18"/>
+        </w:rPr>
+        <w:t>Documento aggiornato il 30 marzo 2026.</w:t>
+      </w:r>
+      <w:r>
+        <w:rPr>
+          <w:i/>
+          <w:color w:val="909090"/>
+          <w:sz w:val="18"/>
+        </w:rPr>
+        <w:t xml:space="preserve"> Fonti: ZeroUnoWeb, ArenaDigitale, LineaEDP, ImpresaCity, DataCenterDynamics, solutions2enterprises.com.</w:t>
       </w:r>
     </w:p>
     <w:sectPr>

</xml_diff>